<commit_message>
Updated body text styles with justification
</commit_message>
<xml_diff>
--- a/utils/template.docx
+++ b/utils/template.docx
@@ -60,7 +60,15 @@
         <w:pStyle w:val="EnglishTarget"/>
       </w:pPr>
       <w:r>
-        <w:t xml:space="preserve">Abū Dāwūd said, “ʿAbd al-Aʿlá ibn Ḥammād, Muḥammad ibn al-Muthanná, Muḥammad ibn Bashshār, and Aḥmad ibn Saʿīd al-Ribāṭī told us: Wahb ibn Jarīr told us: – we wrote from Aḥmad’s </w:t>
+        <w:t xml:space="preserve">Abū Dāwūd said, “ʿAbd al-Aʿlá ibn Ḥammād, Muḥammad ibn al-Muthanná, Muḥammad ibn Bashshār, and Aḥmad ibn Saʿīd al-Ribāṭī told us: Wahb ibn Jarīr told us: – we wrote from </w:t>
+      </w:r>
+      <w:proofErr w:type="spellStart"/>
+      <w:r>
+        <w:t>Aḥmad’s</w:t>
+      </w:r>
+      <w:proofErr w:type="spellEnd"/>
+      <w:r>
+        <w:t xml:space="preserve"> </w:t>
       </w:r>
       <w:r>
         <w:rPr>
@@ -1145,8 +1153,10 @@
     <w:name w:val="Body Text"/>
     <w:basedOn w:val="Normal"/>
     <w:qFormat/>
+    <w:rsid w:val="001F7907"/>
     <w:pPr>
       <w:spacing w:before="180" w:after="180"/>
+      <w:jc w:val="lowKashida"/>
     </w:pPr>
   </w:style>
   <w:style w:type="paragraph" w:customStyle="1" w:styleId="FirstParagraph">
@@ -1154,6 +1164,7 @@
     <w:basedOn w:val="BodyText"/>
     <w:next w:val="BodyText"/>
     <w:qFormat/>
+    <w:rsid w:val="00E70FE9"/>
   </w:style>
   <w:style w:type="paragraph" w:customStyle="1" w:styleId="Compact">
     <w:name w:val="Compact"/>
@@ -1993,13 +2004,13 @@
     <w:rsid w:val="009C3611"/>
     <w:pPr>
       <w:spacing w:line="360" w:lineRule="auto"/>
-      <w:jc w:val="lowKashida"/>
     </w:pPr>
   </w:style>
   <w:style w:type="paragraph" w:customStyle="1" w:styleId="EnglishTarget">
     <w:name w:val="English Target"/>
     <w:basedOn w:val="BodyText"/>
     <w:qFormat/>
+    <w:rsid w:val="00521326"/>
   </w:style>
   <w:style w:type="character" w:customStyle="1" w:styleId="CharBodyHonorifics">
     <w:name w:val="Char Body Honorifics"/>

</xml_diff>